<commit_message>
Refresh MOSI ranking/multi-metric figures and thesis v18
Update fig_mosi_acc7_ranking and fig_mosi_multi_metric, plus
make_mosi_bar.py and build_thesis_v18.py. Refresh thesis v18 docx.

Co-Authored-By: Claude Opus 4.7 <noreply@anthropic.com>
</commit_message>
<xml_diff>
--- a/論文＿李昇峰_v18.docx
+++ b/論文＿李昇峰_v18.docx
@@ -13578,11 +13578,25 @@
             <w:tcW w:w="1187" w:type="dxa"/>
           </w:tcPr>
           <w:p>
+            <w:r/>
+            <w:r>
+              <w:rPr>
+                <w:sz w:val="20"/>
+              </w:rPr>
+              <w:t>77.9</w:t>
+            </w:r>
+          </w:p>
+        </w:tc>
+        <w:tc>
+          <w:tcPr>
+            <w:tcW w:w="1187" w:type="dxa"/>
+          </w:tcPr>
+          <w:p>
             <w:pPr>
               <w:ind w:firstLine="480"/>
             </w:pPr>
             <w:r>
-              <w:t>77.5</w:t>
+              <w:t>0.978</w:t>
             </w:r>
           </w:p>
         </w:tc>
@@ -13595,7 +13609,7 @@
               <w:ind w:firstLine="480"/>
             </w:pPr>
             <w:r>
-              <w:t>0.978</w:t>
+              <w:t>0.658</w:t>
             </w:r>
           </w:p>
         </w:tc>
@@ -13607,11 +13621,10 @@
             <w:pPr>
               <w:ind w:firstLine="480"/>
             </w:pPr>
-            <w:r>
-              <w:t>0.658</w:t>
-            </w:r>
-          </w:p>
-        </w:tc>
+          </w:p>
+        </w:tc>
+      </w:tr>
+      <w:tr>
         <w:tc>
           <w:tcPr>
             <w:tcW w:w="1187" w:type="dxa"/>
@@ -13620,10 +13633,11 @@
             <w:pPr>
               <w:ind w:firstLine="480"/>
             </w:pPr>
-          </w:p>
-        </w:tc>
-      </w:tr>
-      <w:tr>
+            <w:r>
+              <w:t>Graph-MFN</w:t>
+            </w:r>
+          </w:p>
+        </w:tc>
         <w:tc>
           <w:tcPr>
             <w:tcW w:w="1187" w:type="dxa"/>
@@ -13633,7 +13647,7 @@
               <w:ind w:firstLine="480"/>
             </w:pPr>
             <w:r>
-              <w:t>Graph-MFN</w:t>
+              <w:t>34.4</w:t>
             </w:r>
           </w:p>
         </w:tc>
@@ -13646,7 +13660,7 @@
               <w:ind w:firstLine="480"/>
             </w:pPr>
             <w:r>
-              <w:t>34.4</w:t>
+              <w:t>77.9</w:t>
             </w:r>
           </w:p>
         </w:tc>
@@ -13659,7 +13673,21 @@
               <w:ind w:firstLine="480"/>
             </w:pPr>
             <w:r>
-              <w:t>77.9</w:t>
+              <w:t>77.8</w:t>
+            </w:r>
+          </w:p>
+        </w:tc>
+        <w:tc>
+          <w:tcPr>
+            <w:tcW w:w="1187" w:type="dxa"/>
+          </w:tcPr>
+          <w:p>
+            <w:r/>
+            <w:r>
+              <w:rPr>
+                <w:sz w:val="20"/>
+              </w:rPr>
+              <w:t>0.939</w:t>
             </w:r>
           </w:p>
         </w:tc>
@@ -13672,7 +13700,7 @@
               <w:ind w:firstLine="480"/>
             </w:pPr>
             <w:r>
-              <w:t>77.8</w:t>
+              <w:t>0.656</w:t>
             </w:r>
           </w:p>
         </w:tc>
@@ -13684,11 +13712,10 @@
             <w:pPr>
               <w:ind w:firstLine="480"/>
             </w:pPr>
-            <w:r>
-              <w:t>0.989</w:t>
-            </w:r>
-          </w:p>
-        </w:tc>
+          </w:p>
+        </w:tc>
+      </w:tr>
+      <w:tr>
         <w:tc>
           <w:tcPr>
             <w:tcW w:w="1187" w:type="dxa"/>
@@ -13698,7 +13725,7 @@
               <w:ind w:firstLine="480"/>
             </w:pPr>
             <w:r>
-              <w:t>0.656</w:t>
+              <w:t>MFM</w:t>
             </w:r>
           </w:p>
         </w:tc>
@@ -13710,10 +13737,11 @@
             <w:pPr>
               <w:ind w:firstLine="480"/>
             </w:pPr>
-          </w:p>
-        </w:tc>
-      </w:tr>
-      <w:tr>
+            <w:r>
+              <w:t>33.3</w:t>
+            </w:r>
+          </w:p>
+        </w:tc>
         <w:tc>
           <w:tcPr>
             <w:tcW w:w="1187" w:type="dxa"/>
@@ -13723,7 +13751,7 @@
               <w:ind w:firstLine="480"/>
             </w:pPr>
             <w:r>
-              <w:t>MFM</w:t>
+              <w:t>77.7</w:t>
             </w:r>
           </w:p>
         </w:tc>
@@ -13736,7 +13764,7 @@
               <w:ind w:firstLine="480"/>
             </w:pPr>
             <w:r>
-              <w:t>33.3</w:t>
+              <w:t>77.7</w:t>
             </w:r>
           </w:p>
         </w:tc>
@@ -13749,7 +13777,7 @@
               <w:ind w:firstLine="480"/>
             </w:pPr>
             <w:r>
-              <w:t>77.7</w:t>
+              <w:t>0.948</w:t>
             </w:r>
           </w:p>
         </w:tc>
@@ -13762,7 +13790,7 @@
               <w:ind w:firstLine="480"/>
             </w:pPr>
             <w:r>
-              <w:t>77.7</w:t>
+              <w:t>0.664</w:t>
             </w:r>
           </w:p>
         </w:tc>
@@ -13774,11 +13802,10 @@
             <w:pPr>
               <w:ind w:firstLine="480"/>
             </w:pPr>
-            <w:r>
-              <w:t>0.948</w:t>
-            </w:r>
-          </w:p>
-        </w:tc>
+          </w:p>
+        </w:tc>
+      </w:tr>
+      <w:tr>
         <w:tc>
           <w:tcPr>
             <w:tcW w:w="1187" w:type="dxa"/>
@@ -13788,7 +13815,7 @@
               <w:ind w:firstLine="480"/>
             </w:pPr>
             <w:r>
-              <w:t>0.664</w:t>
+              <w:t>MISA</w:t>
             </w:r>
           </w:p>
         </w:tc>
@@ -13800,10 +13827,11 @@
             <w:pPr>
               <w:ind w:firstLine="480"/>
             </w:pPr>
-          </w:p>
-        </w:tc>
-      </w:tr>
-      <w:tr>
+            <w:r>
+              <w:t>43.5</w:t>
+            </w:r>
+          </w:p>
+        </w:tc>
         <w:tc>
           <w:tcPr>
             <w:tcW w:w="1187" w:type="dxa"/>
@@ -13813,7 +13841,7 @@
               <w:ind w:firstLine="480"/>
             </w:pPr>
             <w:r>
-              <w:t>MISA</w:t>
+              <w:t>81.8</w:t>
             </w:r>
           </w:p>
         </w:tc>
@@ -13826,7 +13854,7 @@
               <w:ind w:firstLine="480"/>
             </w:pPr>
             <w:r>
-              <w:t>43.5</w:t>
+              <w:t>81.7</w:t>
             </w:r>
           </w:p>
         </w:tc>
@@ -13839,7 +13867,7 @@
               <w:ind w:firstLine="480"/>
             </w:pPr>
             <w:r>
-              <w:t>81.8</w:t>
+              <w:t>0.752</w:t>
             </w:r>
           </w:p>
         </w:tc>
@@ -13852,7 +13880,7 @@
               <w:ind w:firstLine="480"/>
             </w:pPr>
             <w:r>
-              <w:t>81.7</w:t>
+              <w:t>0.784</w:t>
             </w:r>
           </w:p>
         </w:tc>
@@ -13864,11 +13892,10 @@
             <w:pPr>
               <w:ind w:firstLine="480"/>
             </w:pPr>
-            <w:r>
-              <w:t>0.752</w:t>
-            </w:r>
-          </w:p>
-        </w:tc>
+          </w:p>
+        </w:tc>
+      </w:tr>
+      <w:tr>
         <w:tc>
           <w:tcPr>
             <w:tcW w:w="1187" w:type="dxa"/>
@@ -13878,7 +13905,7 @@
               <w:ind w:firstLine="480"/>
             </w:pPr>
             <w:r>
-              <w:t>0.784</w:t>
+              <w:t>Self-MM</w:t>
             </w:r>
           </w:p>
         </w:tc>
@@ -13890,46 +13917,22 @@
             <w:pPr>
               <w:ind w:firstLine="480"/>
             </w:pPr>
-          </w:p>
-        </w:tc>
-      </w:tr>
-      <w:tr>
+            <w:r>
+              <w:t>45.8</w:t>
+            </w:r>
+          </w:p>
+        </w:tc>
         <w:tc>
           <w:tcPr>
             <w:tcW w:w="1187" w:type="dxa"/>
           </w:tcPr>
           <w:p>
-            <w:pPr>
-              <w:ind w:firstLine="480"/>
-            </w:pPr>
-            <w:r>
-              <w:t>Self-MM</w:t>
-            </w:r>
-          </w:p>
-        </w:tc>
-        <w:tc>
-          <w:tcPr>
-            <w:tcW w:w="1187" w:type="dxa"/>
-          </w:tcPr>
-          <w:p>
-            <w:pPr>
-              <w:ind w:firstLine="480"/>
-            </w:pPr>
-            <w:r>
-              <w:t>45.8</w:t>
-            </w:r>
-          </w:p>
-        </w:tc>
-        <w:tc>
-          <w:tcPr>
-            <w:tcW w:w="1187" w:type="dxa"/>
-          </w:tcPr>
-          <w:p>
-            <w:pPr>
-              <w:ind w:firstLine="480"/>
-            </w:pPr>
-            <w:r>
-              <w:t>82.5</w:t>
+            <w:r/>
+            <w:r>
+              <w:rPr>
+                <w:sz w:val="20"/>
+              </w:rPr>
+              <w:t>82.7</w:t>
             </w:r>
           </w:p>
         </w:tc>
@@ -14416,11 +14419,12 @@
             <w:tcW w:w="1187" w:type="dxa"/>
           </w:tcPr>
           <w:p>
-            <w:pPr>
-              <w:ind w:firstLine="480"/>
-            </w:pPr>
-            <w:r>
-              <w:t>0.790</w:t>
+            <w:r/>
+            <w:r>
+              <w:rPr>
+                <w:sz w:val="20"/>
+              </w:rPr>
+              <w:t>0.782</w:t>
             </w:r>
           </w:p>
         </w:tc>
@@ -14662,11 +14666,12 @@
             <w:tcW w:w="1187" w:type="dxa"/>
           </w:tcPr>
           <w:p>
-            <w:pPr>
-              <w:ind w:firstLine="480"/>
-            </w:pPr>
-            <w:r>
-              <w:t>86.28</w:t>
+            <w:r/>
+            <w:r>
+              <w:rPr>
+                <w:sz w:val="20"/>
+              </w:rPr>
+              <w:t>86.26</w:t>
             </w:r>
           </w:p>
         </w:tc>

</xml_diff>